<commit_message>
fix: enforce safe AI-Startklar onboarding data
</commit_message>
<xml_diff>
--- a/deliverables/ai-startklar/vertrieb/04-angebotsvorlage.docx
+++ b/deliverables/ai-startklar/vertrieb/04-angebotsvorlage.docx
@@ -1349,7 +1349,26 @@
           <w:color w:val="0F172A"/>
           <w:sz w:val="17"/>
         </w:rPr>
-        <w:t>ausschließlich synthetische, ausreichend anonymisierte oder ausdrücklich freigegebene Übungsinhalte</w:t>
+        <w:t>ausschließlich synthetische oder robust anonymisierte, sichere Übungsinhalte.</w:t>
+      </w:r>
+    </w:p>
+    <w:p>
+      <w:pPr>
+        <w:numPr>
+          <w:ilvl w:val="0"/>
+          <w:numId w:val="11"/>
+        </w:numPr>
+        <w:spacing w:after="40" w:line="254" w:lineRule="auto"/>
+      </w:pPr>
+      <w:r>
+        <w:rPr>
+          <w:rFonts w:ascii="Arial" w:hAnsi="Arial" w:eastAsia="Arial"/>
+          <w:b w:val="0"/>
+          <w:i w:val="0"/>
+          <w:color w:val="0F172A"/>
+          <w:sz w:val="17"/>
+        </w:rPr>
+        <w:t>reale personenbezogene, vertrauliche, sicherheitsrelevante oder rote Daten werden nie in Live-Übungen eingegeben.</w:t>
       </w:r>
     </w:p>
     <w:p>

</xml_diff>